<commit_message>
docs(rag): restructure FAQ with headings and dedupe expense policy
- FAQ.txt → FAQ.md：加 ## 标题，分块 heading_path 从空变为
  「常见问题 FAQ > 主题」，修复引用无法定位的问题（P0）
- 报销制度.docx：删除与员工手册重复的概览，改为细则增量
  （发票限额/差旅标准/特殊场景），消除检索稀释（P1）
</commit_message>
<xml_diff>
--- a/data/samples/报销制度.docx
+++ b/data/samples/报销制度.docx
@@ -7,7 +7,7 @@
         <w:pStyle w:val="Heading1"/>
       </w:pPr>
       <w:r>
-        <w:t>报销制度</w:t>
+        <w:t>报销制度（细则）</w:t>
       </w:r>
     </w:p>
     <w:p>
@@ -15,12 +15,27 @@
         <w:pStyle w:val="Heading2"/>
       </w:pPr>
       <w:r>
-        <w:t>发票要求</w:t>
+        <w:t>发票类型与限额</w:t>
       </w:r>
     </w:p>
     <w:p>
       <w:r>
-        <w:t>报销需提供：发票原件（增值税普通发票或专用发票）、费用明细清单、部门审批单。</w:t>
+        <w:t>增值税普通发票：单笔限额 5000 元。</w:t>
+      </w:r>
+    </w:p>
+    <w:p>
+      <w:r>
+        <w:t>增值税专用发票：需附抵扣联，单笔限额 20000 元。</w:t>
+      </w:r>
+    </w:p>
+    <w:p>
+      <w:r>
+        <w:t>电子发票：打印后标注「已报销」字样以防重复报销。</w:t>
+      </w:r>
+    </w:p>
+    <w:p>
+      <w:r>
+        <w:t>交通票据：保留火车、飞机、出租车原始票据。</w:t>
       </w:r>
     </w:p>
     <w:p>
@@ -28,12 +43,22 @@
         <w:pStyle w:val="Heading2"/>
       </w:pPr>
       <w:r>
-        <w:t>审批流程</w:t>
+        <w:t>差旅报销标准</w:t>
       </w:r>
     </w:p>
     <w:p>
       <w:r>
-        <w:t>员工提交报销单，直属主管审批，财务复核后打款，一般 5 个工作日到账。</w:t>
+        <w:t>交通：飞机经济舱、高铁二等座，舱位升级需 VP 审批。</w:t>
+      </w:r>
+    </w:p>
+    <w:p>
+      <w:r>
+        <w:t>住宿：一线城市 600 元/晚，其他城市 450 元/晚。</w:t>
+      </w:r>
+    </w:p>
+    <w:p>
+      <w:r>
+        <w:t>餐饮补贴：出差期间 100 元/天，无需发票。</w:t>
       </w:r>
     </w:p>
     <w:p>
@@ -41,12 +66,35 @@
         <w:pStyle w:val="Heading2"/>
       </w:pPr>
       <w:r>
-        <w:t>差旅报销</w:t>
+        <w:t>特殊场景</w:t>
       </w:r>
     </w:p>
     <w:p>
       <w:r>
-        <w:t>出差交通、住宿按公司标准报销，需附行程单与发票。</w:t>
+        <w:t>预付款：单笔超过 5000 元可向财务申请预付。</w:t>
+      </w:r>
+    </w:p>
+    <w:p>
+      <w:r>
+        <w:t>跨年报销：必须在次年 1 月 15 日前提交。</w:t>
+      </w:r>
+    </w:p>
+    <w:p>
+      <w:r>
+        <w:t>退款订单：需附退款凭证，冲减原报销金额。</w:t>
+      </w:r>
+    </w:p>
+    <w:p>
+      <w:pPr>
+        <w:pStyle w:val="Heading2"/>
+      </w:pPr>
+      <w:r>
+        <w:t>不予报销</w:t>
+      </w:r>
+    </w:p>
+    <w:p>
+      <w:r>
+        <w:t>个人消费（烟酒、娱乐）、无票据支出、超出标准部分均不予报销，由个人承担。</w:t>
       </w:r>
     </w:p>
     <w:sectPr>

</xml_diff>

<commit_message>
feat(kb): expand knowledge base samples with 3 new docs
- 新增: 休假与福利政策.txt / 信息安全与账号权限.md / 差旅与报销标准.pdf
- 更新: FAQ/员工手册/新人入职指南/报销制度.docx + seed.sh 适配
</commit_message>
<xml_diff>
--- a/data/samples/报销制度.docx
+++ b/data/samples/报销制度.docx
@@ -7,7 +7,7 @@
         <w:pStyle w:val="Heading1"/>
       </w:pPr>
       <w:r>
-        <w:t>报销制度（细则）</w:t>
+        <w:t>报销制度</w:t>
       </w:r>
     </w:p>
     <w:p>
@@ -15,27 +15,12 @@
         <w:pStyle w:val="Heading2"/>
       </w:pPr>
       <w:r>
-        <w:t>发票类型与限额</w:t>
+        <w:t>适用范围</w:t>
       </w:r>
     </w:p>
     <w:p>
       <w:r>
-        <w:t>增值税普通发票：单笔限额 5000 元。</w:t>
-      </w:r>
-    </w:p>
-    <w:p>
-      <w:r>
-        <w:t>增值税专用发票：需附抵扣联，单笔限额 20000 元。</w:t>
-      </w:r>
-    </w:p>
-    <w:p>
-      <w:r>
-        <w:t>电子发票：打印后标注「已报销」字样以防重复报销。</w:t>
-      </w:r>
-    </w:p>
-    <w:p>
-      <w:r>
-        <w:t>交通票据：保留火车、飞机、出租车原始票据。</w:t>
+        <w:t>本制度适用于员工因公司业务产生的差旅、办公采购、客户拜访、培训会议、团队活动等费用报销。个人消费、未经审批的费用、超出预算且无合理说明的费用，原则上不予报销。</w:t>
       </w:r>
     </w:p>
     <w:p>
@@ -43,22 +28,38 @@
         <w:pStyle w:val="Heading2"/>
       </w:pPr>
       <w:r>
-        <w:t>差旅报销标准</w:t>
+        <w:t>发票要求</w:t>
       </w:r>
     </w:p>
     <w:p>
       <w:r>
-        <w:t>交通：飞机经济舱、高铁二等座，舱位升级需 VP 审批。</w:t>
+        <w:t>报销需提供发票原件或合规电子发票、费用明细清单、部门审批单。发票抬头必须为公司全称，税号填写正确，金额、日期、消费项目应与实际业务一致。电子发票需上传原始版式文件，截图、照片或重复打印件不能作为唯一凭证。</w:t>
+      </w:r>
+    </w:p>
+    <w:p>
+      <w:pPr>
+        <w:pStyle w:val="Heading2"/>
+      </w:pPr>
+      <w:r>
+        <w:t>审批流程</w:t>
       </w:r>
     </w:p>
     <w:p>
       <w:r>
-        <w:t>住宿：一线城市 600 元/晚，其他城市 450 元/晚。</w:t>
+        <w:t>员工在 OA 系统提交报销单后，直属主管审批业务真实性，部门负责人确认预算，财务部门复核发票和附件。材料齐全且无异常的，一般 5 个工作日内打款；月底提交或遇到发票核验异常的，可能顺延至次月处理。</w:t>
+      </w:r>
+    </w:p>
+    <w:p>
+      <w:pPr>
+        <w:pStyle w:val="Heading2"/>
+      </w:pPr>
+      <w:r>
+        <w:t>差旅报销</w:t>
       </w:r>
     </w:p>
     <w:p>
       <w:r>
-        <w:t>餐饮补贴：出差期间 100 元/天，无需发票。</w:t>
+        <w:t>出差交通、住宿、餐饮和必要市内交通可按公司标准报销。交通费用需附行程单或车票，住宿费用需附酒店水单和发票，客户拜访费用需注明客户名称、拜访目的和同行人员。</w:t>
       </w:r>
     </w:p>
     <w:p>
@@ -71,17 +72,20 @@
     </w:p>
     <w:p>
       <w:r>
-        <w:t>预付款：单笔超过 5000 元可向财务申请预付。</w:t>
+        <w:t>客户现场紧急支持、展会旺季酒店涨价、航班延误改签等特殊场景导致超标的，员工应在报销单中说明原因并上传证明材料。主管确认业务必要性后，财务按例外流程复核。</w:t>
+      </w:r>
+    </w:p>
+    <w:p>
+      <w:pPr>
+        <w:pStyle w:val="Heading2"/>
+      </w:pPr>
+      <w:r>
+        <w:t>退回与补充</w:t>
       </w:r>
     </w:p>
     <w:p>
       <w:r>
-        <w:t>跨年报销：必须在次年 1 月 15 日前提交。</w:t>
-      </w:r>
-    </w:p>
-    <w:p>
-      <w:r>
-        <w:t>退款订单：需附退款凭证，冲减原报销金额。</w:t>
+        <w:t>报销单被退回时，应根据财务备注补充发票、付款凭证、行程单、审批说明或费用明细。补充完成后重新提交原流程，不要重复创建多个报销单。超过 30 天未重新提交的，报销单将自动关闭。</w:t>
       </w:r>
     </w:p>
     <w:p>
@@ -94,7 +98,7 @@
     </w:p>
     <w:p>
       <w:r>
-        <w:t>个人消费（烟酒、娱乐）、无票据支出、超出标准部分均不予报销，由个人承担。</w:t>
+        <w:t>个人娱乐消费、无业务关系的礼品、酒水烟草、交通违章罚款、丢失票据且无法证明真实性的费用、未经审批的高额采购，均不予报销。</w:t>
       </w:r>
     </w:p>
     <w:sectPr>

</xml_diff>